<commit_message>
Module 1: team notes file; assignment due by end of class
</commit_message>
<xml_diff>
--- a/assignments/CP-Module-01-Assignment.docx
+++ b/assignments/CP-Module-01-Assignment.docx
@@ -193,7 +193,7 @@
           <w:b w:val="0"/>
           <w:i w:val="0"/>
         </w:rPr>
-        <w:t>In class, you played a practitioner on Denise's team and helped build her systems map. This assignment captures what you learned, in your own words.</w:t>
+        <w:t>In class, you played a practitioner on Denise's team and helped build her systems map. This assignment captures what you learned, in your own words. You complete it in class. There is no homework.</w:t>
       </w:r>
     </w:p>
     <w:p>
@@ -207,7 +207,7 @@
         <w:t xml:space="preserve">How to complete it: </w:t>
       </w:r>
       <w:r>
-        <w:t>Download this file, type your answers into the shaded boxes, and save it.</w:t>
+        <w:t>Download this file, type your answers into the shaded boxes, and save it. Use your team notes for Part 2.</w:t>
       </w:r>
     </w:p>
     <w:p>
@@ -235,7 +235,7 @@
         <w:t xml:space="preserve">Due: </w:t>
       </w:r>
       <w:r>
-        <w:t>By the start of Module 2. You will finish most of it in class.</w:t>
+        <w:t>By the end of class today. Upload it before you leave.</w:t>
       </w:r>
     </w:p>
     <w:p>
@@ -276,7 +276,7 @@
               <w:t xml:space="preserve">Remember:  </w:t>
             </w:r>
             <w:r>
-              <w:t>Denise is fictional. Never include real client names or details, and never put client information into an AI tool.</w:t>
+              <w:t>Denise is fictional. Never include real client names or details.</w:t>
             </w:r>
           </w:p>
         </w:tc>
@@ -1232,7 +1232,7 @@
                 <w:b/>
                 <w:color w:val="3F6B50"/>
               </w:rPr>
-              <w:t xml:space="preserve">In your own words · no AI.  </w:t>
+              <w:t xml:space="preserve">In your own words.  </w:t>
             </w:r>
             <w:r>
               <w:t>Write this part yourself. You choose what to share, and you never have to share more than you're comfortable with. Your strengths will go into your résumé during Job Search.</w:t>

</xml_diff>